<commit_message>
Add professional handout versions with Brain.png header, web pages, and PDF
- Create web and PDF versions of "Benefits of Brain-Based Clinician" handout
- Add professional header inspired by Brain.png with neural glow design
- Link handout from Professionals page Step 0 Learn pillar (web + PDF)
- Add handout web pages with site nav and download buttons
- Generate actual PDF in handouts folder
- Add Section 7 to Group Feedback document for team handout review
- Update footer to "Sponsored by the FASD United Mental Health Work Group"

Co-Authored-By: Claude Opus 4.6 (1M context) <noreply@anthropic.com>
</commit_message>
<xml_diff>
--- a/Group-Feedback-Website-Title.docx
+++ b/Group-Feedback-Website-Title.docx
@@ -1250,6 +1250,67 @@
       </w:r>
     </w:p>
     <w:p>
+      <w:r>
+        <w:rPr>
+          <w:b/>
+          <w:sz w:val="24"/>
+        </w:rPr>
+        <w:t>7. Handout Review — Benefits of Brain-Based Clinician (Step 0)</w:t>
+      </w:r>
+    </w:p>
+    <w:p>
+      <w:r>
+        <w:rPr>
+          <w:sz w:val="20"/>
+        </w:rPr>
+        <w:t>Please review the redesigned “The Benefits of Becoming a Brain-Based Informed Mental Health Clinician” handout (PDF). This is a one-page printable handout linked from Step 0: Why This Matters on the Professionals page. It features a professional header with the Brain image, two-column layout, FASD United logo, and a link back to the website.</w:t>
+      </w:r>
+    </w:p>
+    <w:p>
+      <w:r>
+        <w:rPr>
+          <w:i/>
+          <w:sz w:val="20"/>
+        </w:rPr>
+        <w:t>PDF location: handouts/Benefits-of-Brain-Based-Clinician-Handout.pdf</w:t>
+      </w:r>
+    </w:p>
+    <w:p/>
+    <w:p>
+      <w:r>
+        <w:rPr>
+          <w:sz w:val="20"/>
+        </w:rPr>
+        <w:t>Question 7a: Is the handout readable and professional enough for distribution?</w:t>
+      </w:r>
+    </w:p>
+    <w:p>
+      <w:r>
+        <w:rPr>
+          <w:sz w:val="20"/>
+        </w:rPr>
+        <w:t>_____________________________________________________________________________________</w:t>
+      </w:r>
+    </w:p>
+    <w:p>
+      <w:r>
+        <w:rPr>
+          <w:sz w:val="20"/>
+        </w:rPr>
+        <w:t>Question 7b: Any changes to the text, layout, or branding?</w:t>
+      </w:r>
+    </w:p>
+    <w:p>
+      <w:r>
+        <w:rPr>
+          <w:sz w:val="20"/>
+        </w:rPr>
+        <w:t>_____________________________________________________________________________________</w:t>
+      </w:r>
+    </w:p>
+    <w:p/>
+    <w:p/>
+    <w:p>
       <w:pPr>
         <w:jc w:val="center"/>
       </w:pPr>

</xml_diff>